<commit_message>
Results: B lineage T-cell Exhaustion/HLA  and figures
</commit_message>
<xml_diff>
--- a/manuscript/manuscript.docx
+++ b/manuscript/manuscript.docx
@@ -561,21 +561,7 @@
           <w:rFonts w:ascii="Times New Roman" w:hAnsi="Times New Roman" w:cs="Times New Roman"/>
           <w:lang w:val="en-US"/>
         </w:rPr>
-        <w:t xml:space="preserve"> R package (v3.54.2), adopting an exploratory heuristic threshold (nominal p &lt; 0.05, |</w:t>
-      </w:r>
-      <w:r>
-        <w:rPr>
-          <w:rFonts w:ascii="Times New Roman" w:hAnsi="Times New Roman" w:cs="Times New Roman"/>
-          <w:lang w:val="en-US"/>
-        </w:rPr>
-        <w:t xml:space="preserve"> </w:t>
-      </w:r>
-      <w:r>
-        <w:rPr>
-          <w:rFonts w:ascii="Times New Roman" w:hAnsi="Times New Roman" w:cs="Times New Roman"/>
-          <w:lang w:val="en-US"/>
-        </w:rPr>
-        <w:t>Log2</w:t>
+        <w:t xml:space="preserve"> R package (v3.54.2), adopting an exploratory heuristic threshold (nominal p &lt; 0.05, | Log2</w:t>
       </w:r>
       <w:r>
         <w:rPr>
@@ -1229,6 +1215,7 @@
         <w:jc w:val="both"/>
         <w:rPr>
           <w:rFonts w:ascii="Times New Roman" w:hAnsi="Times New Roman" w:cs="Times New Roman"/>
+          <w:lang w:val="en-US"/>
         </w:rPr>
       </w:pPr>
       <w:r>
@@ -1238,52 +1225,1020 @@
         </w:rPr>
         <w:t>To mitigate the inflation of false positives (Type I error) inherent to genomic multiple testing scenarios (DEA and GSEA), nominal p-values were systematically adjusted using the Benjamini-Hochberg method, thereby controlling the False Discovery Rate (FDR). A two-tailed statistical significance threshold of p &lt; 0.05 was adopted a priori across all inferential analyses. The visualization of high-dimensional complex data was orchestrated primarily utilizing the ggplot2 (v3.4.2), ComplexHeatmap (v2.14.0), and survminer (v0.4.9) R packages.</w:t>
       </w:r>
-      <w:r>
-        <w:rPr>
-          <w:rFonts w:ascii="Times New Roman" w:hAnsi="Times New Roman" w:cs="Times New Roman"/>
-          <w:lang w:val="en-US"/>
-        </w:rPr>
-        <w:br w:type="page"/>
+    </w:p>
+    <w:p>
+      <w:pPr>
+        <w:spacing w:after="0" w:line="480" w:lineRule="auto"/>
+        <w:jc w:val="both"/>
+        <w:rPr>
+          <w:rFonts w:ascii="Times New Roman" w:hAnsi="Times New Roman" w:cs="Times New Roman"/>
+          <w:lang w:val="en-US"/>
+        </w:rPr>
+      </w:pPr>
+    </w:p>
+    <w:p>
+      <w:pPr>
+        <w:spacing w:after="0" w:line="480" w:lineRule="auto"/>
+        <w:jc w:val="both"/>
+        <w:rPr>
+          <w:rFonts w:ascii="Times New Roman" w:hAnsi="Times New Roman" w:cs="Times New Roman"/>
+        </w:rPr>
+      </w:pPr>
+      <w:r>
+        <w:rPr>
+          <w:rFonts w:ascii="Times New Roman" w:hAnsi="Times New Roman" w:cs="Times New Roman"/>
+          <w:b/>
+          <w:bCs/>
+        </w:rPr>
+        <w:t xml:space="preserve">3. </w:t>
+      </w:r>
+      <w:r>
+        <w:rPr>
+          <w:rFonts w:ascii="Times New Roman" w:hAnsi="Times New Roman" w:cs="Times New Roman"/>
+          <w:b/>
+          <w:bCs/>
+        </w:rPr>
+        <w:t>Resultados</w:t>
+      </w:r>
+    </w:p>
+    <w:p>
+      <w:pPr>
+        <w:spacing w:after="0" w:line="480" w:lineRule="auto"/>
+        <w:jc w:val="both"/>
+        <w:rPr>
+          <w:rFonts w:ascii="Times New Roman" w:hAnsi="Times New Roman" w:cs="Times New Roman"/>
+        </w:rPr>
+      </w:pPr>
+    </w:p>
+    <w:p>
+      <w:pPr>
+        <w:spacing w:after="0" w:line="480" w:lineRule="auto"/>
+        <w:jc w:val="both"/>
+        <w:rPr>
+          <w:rFonts w:ascii="Times New Roman" w:hAnsi="Times New Roman" w:cs="Times New Roman"/>
+          <w:b/>
+          <w:bCs/>
+        </w:rPr>
+      </w:pPr>
+      <w:r>
+        <w:rPr>
+          <w:rFonts w:ascii="Times New Roman" w:hAnsi="Times New Roman" w:cs="Times New Roman"/>
+          <w:b/>
+          <w:bCs/>
+        </w:rPr>
+        <w:t xml:space="preserve">3.1 A Integridade da Linhagem B, e não Apenas a Expressão Isolada de CD19, Condiciona a Resposta ao </w:t>
+      </w:r>
+      <w:proofErr w:type="spellStart"/>
+      <w:r>
+        <w:rPr>
+          <w:rFonts w:ascii="Times New Roman" w:hAnsi="Times New Roman" w:cs="Times New Roman"/>
+          <w:b/>
+          <w:bCs/>
+        </w:rPr>
+        <w:t>Axi-cel</w:t>
+      </w:r>
+      <w:proofErr w:type="spellEnd"/>
+    </w:p>
+    <w:p>
+      <w:pPr>
+        <w:spacing w:after="0" w:line="480" w:lineRule="auto"/>
+        <w:jc w:val="both"/>
+        <w:rPr>
+          <w:rFonts w:ascii="Times New Roman" w:hAnsi="Times New Roman" w:cs="Times New Roman"/>
+        </w:rPr>
+      </w:pPr>
+    </w:p>
+    <w:p>
+      <w:pPr>
+        <w:spacing w:after="0" w:line="480" w:lineRule="auto"/>
+        <w:ind w:firstLine="709"/>
+        <w:jc w:val="both"/>
+        <w:rPr>
+          <w:rFonts w:ascii="Times New Roman" w:hAnsi="Times New Roman" w:cs="Times New Roman"/>
+        </w:rPr>
+      </w:pPr>
+      <w:r>
+        <w:rPr>
+          <w:rFonts w:ascii="Times New Roman" w:hAnsi="Times New Roman" w:cs="Times New Roman"/>
+        </w:rPr>
+        <w:t xml:space="preserve">A avaliação do alvo terapêutico na clínica é frequentemente resumida à presença isolada do gene CD19. No entanto, nossos dados revelam que a elevada expressão de CD19 por si só não assegura a eficácia do </w:t>
+      </w:r>
+      <w:proofErr w:type="spellStart"/>
+      <w:r>
+        <w:rPr>
+          <w:rFonts w:ascii="Times New Roman" w:hAnsi="Times New Roman" w:cs="Times New Roman"/>
+        </w:rPr>
+        <w:t>Axi-cel</w:t>
+      </w:r>
+      <w:proofErr w:type="spellEnd"/>
+      <w:r>
+        <w:rPr>
+          <w:rFonts w:ascii="Times New Roman" w:hAnsi="Times New Roman" w:cs="Times New Roman"/>
+        </w:rPr>
+        <w:t>, sendo fundamental avaliar a integridade fenotípica global da linhagem de células B.</w:t>
+      </w:r>
+      <w:r>
+        <w:rPr>
+          <w:rFonts w:ascii="Times New Roman" w:hAnsi="Times New Roman" w:cs="Times New Roman"/>
+        </w:rPr>
+        <w:t xml:space="preserve"> </w:t>
+      </w:r>
+      <w:r>
+        <w:rPr>
+          <w:rFonts w:ascii="Times New Roman" w:hAnsi="Times New Roman" w:cs="Times New Roman"/>
+        </w:rPr>
+        <w:t xml:space="preserve">Na coorte </w:t>
+      </w:r>
+      <w:proofErr w:type="spellStart"/>
+      <w:r>
+        <w:rPr>
+          <w:rFonts w:ascii="Times New Roman" w:hAnsi="Times New Roman" w:cs="Times New Roman"/>
+        </w:rPr>
+        <w:t>Axi-cel</w:t>
+      </w:r>
+      <w:proofErr w:type="spellEnd"/>
+      <w:r>
+        <w:rPr>
+          <w:rFonts w:ascii="Times New Roman" w:hAnsi="Times New Roman" w:cs="Times New Roman"/>
+        </w:rPr>
+        <w:t xml:space="preserve"> do estudo ZUMA-7, pacientes que alcançaram resposta clínica sustentada apresentaram uma </w:t>
       </w:r>
       <w:r>
         <w:rPr>
           <w:rFonts w:ascii="Times New Roman" w:hAnsi="Times New Roman" w:cs="Times New Roman"/>
         </w:rPr>
         <w:lastRenderedPageBreak/>
-        <w:t>2.2</w:t>
-      </w:r>
-    </w:p>
-    <w:p>
-      <w:pPr>
-        <w:rPr>
-          <w:rFonts w:ascii="Times New Roman" w:hAnsi="Times New Roman" w:cs="Times New Roman"/>
-        </w:rPr>
-      </w:pPr>
-      <w:r>
-        <w:rPr>
-          <w:rFonts w:ascii="Times New Roman" w:hAnsi="Times New Roman" w:cs="Times New Roman"/>
-        </w:rPr>
-        <w:br w:type="page"/>
-      </w:r>
-    </w:p>
-    <w:p>
-      <w:pPr>
-        <w:spacing w:after="0" w:line="480" w:lineRule="auto"/>
-        <w:jc w:val="both"/>
-        <w:rPr>
-          <w:rFonts w:ascii="Times New Roman" w:hAnsi="Times New Roman" w:cs="Times New Roman"/>
-        </w:rPr>
-      </w:pPr>
-      <w:r>
-        <w:rPr>
-          <w:rFonts w:ascii="Times New Roman" w:hAnsi="Times New Roman" w:cs="Times New Roman"/>
+        <w:t>tendência consistente de maior expressão basal de todo o painel de marcadores de linhagem B (CD19, MS4A1/CD20, TNFRSF17) em comparação àqueles que falharam (Figura 1A). Esse perfil indica que a sensibilidade ao CAR-T depende da preservação do programa transcricional B como um todo no tumor, e não apenas da abundância pontual de CD19.</w:t>
+      </w:r>
+    </w:p>
+    <w:p>
+      <w:pPr>
+        <w:spacing w:after="0" w:line="480" w:lineRule="auto"/>
+        <w:jc w:val="both"/>
+        <w:rPr>
+          <w:rFonts w:ascii="Times New Roman" w:hAnsi="Times New Roman" w:cs="Times New Roman"/>
+        </w:rPr>
+      </w:pPr>
+      <w:r>
+        <w:rPr>
+          <w:rFonts w:ascii="Times New Roman" w:hAnsi="Times New Roman" w:cs="Times New Roman"/>
+          <w:noProof/>
+        </w:rPr>
+        <w:drawing>
+          <wp:inline distT="0" distB="0" distL="0" distR="0" wp14:anchorId="25AA53AE" wp14:editId="350D3E63">
+            <wp:extent cx="5400040" cy="5667375"/>
+            <wp:effectExtent l="0" t="0" r="0" b="9525"/>
+            <wp:docPr id="180658449" name="Imagem 3"/>
+            <wp:cNvGraphicFramePr>
+              <a:graphicFrameLocks xmlns:a="http://schemas.openxmlformats.org/drawingml/2006/main" noChangeAspect="1"/>
+            </wp:cNvGraphicFramePr>
+            <a:graphic xmlns:a="http://schemas.openxmlformats.org/drawingml/2006/main">
+              <a:graphicData uri="http://schemas.openxmlformats.org/drawingml/2006/picture">
+                <pic:pic xmlns:pic="http://schemas.openxmlformats.org/drawingml/2006/picture">
+                  <pic:nvPicPr>
+                    <pic:cNvPr id="180658449" name="Imagem 180658449"/>
+                    <pic:cNvPicPr/>
+                  </pic:nvPicPr>
+                  <pic:blipFill>
+                    <a:blip r:embed="rId6" cstate="print">
+                      <a:extLst>
+                        <a:ext uri="{28A0092B-C50C-407E-A947-70E740481C1C}">
+                          <a14:useLocalDpi xmlns:a14="http://schemas.microsoft.com/office/drawing/2010/main" val="0"/>
+                        </a:ext>
+                      </a:extLst>
+                    </a:blip>
+                    <a:stretch>
+                      <a:fillRect/>
+                    </a:stretch>
+                  </pic:blipFill>
+                  <pic:spPr>
+                    <a:xfrm>
+                      <a:off x="0" y="0"/>
+                      <a:ext cx="5400040" cy="5667375"/>
+                    </a:xfrm>
+                    <a:prstGeom prst="rect">
+                      <a:avLst/>
+                    </a:prstGeom>
+                  </pic:spPr>
+                </pic:pic>
+              </a:graphicData>
+            </a:graphic>
+          </wp:inline>
+        </w:drawing>
+      </w:r>
+    </w:p>
+    <w:p>
+      <w:pPr>
+        <w:spacing w:after="0" w:line="240" w:lineRule="auto"/>
+        <w:jc w:val="both"/>
+        <w:rPr>
+          <w:rFonts w:ascii="Times New Roman" w:hAnsi="Times New Roman" w:cs="Times New Roman"/>
+          <w:sz w:val="20"/>
+          <w:szCs w:val="20"/>
+          <w:lang w:val="en-US"/>
+        </w:rPr>
+      </w:pPr>
+      <w:r>
+        <w:rPr>
+          <w:rFonts w:ascii="Times New Roman" w:hAnsi="Times New Roman" w:cs="Times New Roman"/>
+          <w:b/>
+          <w:bCs/>
+          <w:sz w:val="20"/>
+          <w:szCs w:val="20"/>
+          <w:lang w:val="en-US"/>
+        </w:rPr>
+        <w:t>Figure 1. Baseline availability and longitudinal assessment of canonical B-cell lineage markers demonstrate the efficacy of Axi-cel.</w:t>
+      </w:r>
+      <w:r>
+        <w:rPr>
+          <w:rFonts w:ascii="Times New Roman" w:hAnsi="Times New Roman" w:cs="Times New Roman"/>
+          <w:sz w:val="20"/>
+          <w:szCs w:val="20"/>
+          <w:lang w:val="en-US"/>
+        </w:rPr>
+        <w:t xml:space="preserve"> </w:t>
+      </w:r>
+      <w:r>
+        <w:rPr>
+          <w:rFonts w:ascii="Times New Roman" w:hAnsi="Times New Roman" w:cs="Times New Roman"/>
+          <w:b/>
+          <w:bCs/>
+          <w:sz w:val="20"/>
+          <w:szCs w:val="20"/>
+          <w:lang w:val="en-US"/>
+        </w:rPr>
+        <w:t>(A)</w:t>
+      </w:r>
+      <w:r>
+        <w:rPr>
+          <w:rFonts w:ascii="Times New Roman" w:hAnsi="Times New Roman" w:cs="Times New Roman"/>
+          <w:sz w:val="20"/>
+          <w:szCs w:val="20"/>
+          <w:lang w:val="en-US"/>
+        </w:rPr>
+        <w:t xml:space="preserve"> Pre-infusion (baseline) mRNA expression levels (Log</w:t>
+      </w:r>
+      <w:r>
+        <w:rPr>
+          <w:rFonts w:ascii="Times New Roman" w:hAnsi="Times New Roman" w:cs="Times New Roman"/>
+          <w:sz w:val="20"/>
+          <w:szCs w:val="20"/>
+          <w:vertAlign w:val="subscript"/>
+          <w:lang w:val="en-US"/>
+        </w:rPr>
+        <w:t>2</w:t>
+      </w:r>
+      <w:r>
+        <w:rPr>
+          <w:rFonts w:ascii="Times New Roman" w:hAnsi="Times New Roman" w:cs="Times New Roman"/>
+          <w:sz w:val="20"/>
+          <w:szCs w:val="20"/>
+          <w:lang w:val="en-US"/>
+        </w:rPr>
+        <w:t>) of canonical B-cell lineage markers (CD19, MS4A1/CD20, and TNFRSF17)</w:t>
+      </w:r>
+      <w:r>
+        <w:rPr>
+          <w:rFonts w:ascii="Times New Roman" w:hAnsi="Times New Roman" w:cs="Times New Roman"/>
+          <w:sz w:val="20"/>
+          <w:szCs w:val="20"/>
+          <w:lang w:val="en-US"/>
+        </w:rPr>
+        <w:t xml:space="preserve"> - </w:t>
+      </w:r>
+      <w:r>
+        <w:rPr>
+          <w:rFonts w:ascii="Times New Roman" w:hAnsi="Times New Roman" w:cs="Times New Roman"/>
+          <w:sz w:val="20"/>
+          <w:szCs w:val="20"/>
+          <w:lang w:val="en-US"/>
+        </w:rPr>
+        <w:t>corresponding to the panel established in the pivotal ZUMA-7 study (Locke et al., 2024)</w:t>
+      </w:r>
+      <w:r>
+        <w:rPr>
+          <w:rFonts w:ascii="Times New Roman" w:hAnsi="Times New Roman" w:cs="Times New Roman"/>
+          <w:sz w:val="20"/>
+          <w:szCs w:val="20"/>
+          <w:lang w:val="en-US"/>
+        </w:rPr>
+        <w:t xml:space="preserve"> - </w:t>
+      </w:r>
+      <w:r>
+        <w:rPr>
+          <w:rFonts w:ascii="Times New Roman" w:hAnsi="Times New Roman" w:cs="Times New Roman"/>
+          <w:sz w:val="20"/>
+          <w:szCs w:val="20"/>
+          <w:lang w:val="en-US"/>
+        </w:rPr>
+        <w:t xml:space="preserve">assessed in the Axi-cel-treated cohort. Patients are stratified by durable clinical </w:t>
+      </w:r>
+      <w:proofErr w:type="gramStart"/>
+      <w:r>
+        <w:rPr>
+          <w:rFonts w:ascii="Times New Roman" w:hAnsi="Times New Roman" w:cs="Times New Roman"/>
+          <w:sz w:val="20"/>
+          <w:szCs w:val="20"/>
+          <w:lang w:val="en-US"/>
+        </w:rPr>
+        <w:t>outcome</w:t>
+      </w:r>
+      <w:proofErr w:type="gramEnd"/>
+      <w:r>
+        <w:rPr>
+          <w:rFonts w:ascii="Times New Roman" w:hAnsi="Times New Roman" w:cs="Times New Roman"/>
+          <w:sz w:val="20"/>
+          <w:szCs w:val="20"/>
+          <w:lang w:val="en-US"/>
+        </w:rPr>
+        <w:t xml:space="preserve"> (sustained response versus failure). </w:t>
+      </w:r>
+      <w:r>
+        <w:rPr>
+          <w:rFonts w:ascii="Times New Roman" w:hAnsi="Times New Roman" w:cs="Times New Roman"/>
+          <w:b/>
+          <w:bCs/>
+          <w:sz w:val="20"/>
+          <w:szCs w:val="20"/>
+          <w:lang w:val="en-US"/>
+        </w:rPr>
+        <w:t>(B)</w:t>
+      </w:r>
+      <w:r>
+        <w:rPr>
+          <w:rFonts w:ascii="Times New Roman" w:hAnsi="Times New Roman" w:cs="Times New Roman"/>
+          <w:sz w:val="20"/>
+          <w:szCs w:val="20"/>
+          <w:lang w:val="en-US"/>
+        </w:rPr>
+        <w:t xml:space="preserve"> Baseline expression of the same pivotal gene panel from the ZUMA-7 study in the standard-of-care (SOC) control arm. </w:t>
+      </w:r>
+      <w:r>
+        <w:rPr>
+          <w:rFonts w:ascii="Times New Roman" w:hAnsi="Times New Roman" w:cs="Times New Roman"/>
+          <w:b/>
+          <w:bCs/>
+          <w:sz w:val="20"/>
+          <w:szCs w:val="20"/>
+          <w:lang w:val="en-US"/>
+        </w:rPr>
+        <w:t>(C)</w:t>
+      </w:r>
+      <w:r>
+        <w:rPr>
+          <w:rFonts w:ascii="Times New Roman" w:hAnsi="Times New Roman" w:cs="Times New Roman"/>
+          <w:sz w:val="20"/>
+          <w:szCs w:val="20"/>
+          <w:lang w:val="en-US"/>
+        </w:rPr>
+        <w:t xml:space="preserve"> Baseline expression of B-cell-specific markers (CD19, MS4A1, CD79A, CD79B) defined in the pivotal ZUMA-1 study (Scholler et al., 2022), assessed in the ZUMA-1 cohort and stratified by clinical </w:t>
+      </w:r>
+      <w:r>
+        <w:rPr>
+          <w:rFonts w:ascii="Times New Roman" w:hAnsi="Times New Roman" w:cs="Times New Roman"/>
+          <w:sz w:val="20"/>
+          <w:szCs w:val="20"/>
+          <w:lang w:val="en-US"/>
         </w:rPr>
         <w:lastRenderedPageBreak/>
+        <w:t xml:space="preserve">response (CR versus Non-CR). </w:t>
+      </w:r>
+      <w:r>
+        <w:rPr>
+          <w:rFonts w:ascii="Times New Roman" w:hAnsi="Times New Roman" w:cs="Times New Roman"/>
+          <w:b/>
+          <w:bCs/>
+          <w:sz w:val="20"/>
+          <w:szCs w:val="20"/>
+          <w:lang w:val="en-US"/>
+        </w:rPr>
+        <w:t>(D)</w:t>
+      </w:r>
+      <w:r>
+        <w:rPr>
+          <w:rFonts w:ascii="Times New Roman" w:hAnsi="Times New Roman" w:cs="Times New Roman"/>
+          <w:sz w:val="20"/>
+          <w:szCs w:val="20"/>
+          <w:lang w:val="en-US"/>
+        </w:rPr>
+        <w:t xml:space="preserve"> Paired longitudinal analysis comparing target gene expression between baseline (pre-infusion) and post-CAR-T biopsies in patients from the ZUMA-1 study. Comparisons were performed using the Wilcoxon rank-sum test </w:t>
+      </w:r>
+      <w:r>
+        <w:rPr>
+          <w:rFonts w:ascii="Times New Roman" w:hAnsi="Times New Roman" w:cs="Times New Roman"/>
+          <w:b/>
+          <w:bCs/>
+          <w:sz w:val="20"/>
+          <w:szCs w:val="20"/>
+          <w:lang w:val="en-US"/>
+        </w:rPr>
+        <w:t>(A</w:t>
+      </w:r>
+      <w:r>
+        <w:rPr>
+          <w:rFonts w:ascii="Times New Roman" w:hAnsi="Times New Roman" w:cs="Times New Roman"/>
+          <w:b/>
+          <w:bCs/>
+          <w:sz w:val="20"/>
+          <w:szCs w:val="20"/>
+          <w:lang w:val="en-US"/>
+        </w:rPr>
+        <w:t>-</w:t>
+      </w:r>
+      <w:r>
+        <w:rPr>
+          <w:rFonts w:ascii="Times New Roman" w:hAnsi="Times New Roman" w:cs="Times New Roman"/>
+          <w:b/>
+          <w:bCs/>
+          <w:sz w:val="20"/>
+          <w:szCs w:val="20"/>
+          <w:lang w:val="en-US"/>
+        </w:rPr>
+        <w:t>C)</w:t>
+      </w:r>
+      <w:r>
+        <w:rPr>
+          <w:rFonts w:ascii="Times New Roman" w:hAnsi="Times New Roman" w:cs="Times New Roman"/>
+          <w:sz w:val="20"/>
+          <w:szCs w:val="20"/>
+          <w:lang w:val="en-US"/>
+        </w:rPr>
+        <w:t xml:space="preserve"> and the Wilcoxon signed-rank test </w:t>
+      </w:r>
+      <w:r>
+        <w:rPr>
+          <w:rFonts w:ascii="Times New Roman" w:hAnsi="Times New Roman" w:cs="Times New Roman"/>
+          <w:b/>
+          <w:bCs/>
+          <w:sz w:val="20"/>
+          <w:szCs w:val="20"/>
+          <w:lang w:val="en-US"/>
+        </w:rPr>
+        <w:t>(D)</w:t>
+      </w:r>
+      <w:r>
+        <w:rPr>
+          <w:rFonts w:ascii="Times New Roman" w:hAnsi="Times New Roman" w:cs="Times New Roman"/>
+          <w:sz w:val="20"/>
+          <w:szCs w:val="20"/>
+          <w:lang w:val="en-US"/>
+        </w:rPr>
+        <w:t>, with the Benjamini-Hochberg False Discovery Rate (FDR) correction applied specifically to the pivotal gene panels evaluated. Boxplots overlaid on violin plots indicate the median and interquartile range. Overlaid scatter points are color-coded according to granular clinical classifications.</w:t>
+      </w:r>
+    </w:p>
+    <w:p>
+      <w:pPr>
+        <w:spacing w:after="0" w:line="480" w:lineRule="auto"/>
+        <w:jc w:val="both"/>
+        <w:rPr>
+          <w:rFonts w:ascii="Times New Roman" w:hAnsi="Times New Roman" w:cs="Times New Roman"/>
+          <w:lang w:val="en-US"/>
+        </w:rPr>
+      </w:pPr>
+    </w:p>
+    <w:p>
+      <w:pPr>
+        <w:spacing w:after="0" w:line="480" w:lineRule="auto"/>
+        <w:ind w:firstLine="709"/>
+        <w:jc w:val="both"/>
+        <w:rPr>
+          <w:rFonts w:ascii="Times New Roman" w:hAnsi="Times New Roman" w:cs="Times New Roman"/>
+        </w:rPr>
+      </w:pPr>
+      <w:r>
+        <w:rPr>
+          <w:rFonts w:ascii="Times New Roman" w:hAnsi="Times New Roman" w:cs="Times New Roman"/>
+        </w:rPr>
+        <w:t xml:space="preserve">Essa associação foi </w:t>
+      </w:r>
+      <w:proofErr w:type="spellStart"/>
+      <w:r>
+        <w:rPr>
+          <w:rFonts w:ascii="Times New Roman" w:hAnsi="Times New Roman" w:cs="Times New Roman"/>
+        </w:rPr>
+        <w:t>mecanisticamente</w:t>
+      </w:r>
+      <w:proofErr w:type="spellEnd"/>
+      <w:r>
+        <w:rPr>
+          <w:rFonts w:ascii="Times New Roman" w:hAnsi="Times New Roman" w:cs="Times New Roman"/>
+        </w:rPr>
+        <w:t xml:space="preserve"> específica para a terapia celular, não sendo observada qualquer diferença significativa nos marcadores de linhagem B no braço de quimioterapia padrão (SOC) do ZUMA-7 (Figura 1B) ou no baseline da coorte ZUMA-1 (Figura 1C).</w:t>
+      </w:r>
+      <w:r>
+        <w:rPr>
+          <w:rFonts w:ascii="Times New Roman" w:hAnsi="Times New Roman" w:cs="Times New Roman"/>
+        </w:rPr>
+        <w:t xml:space="preserve"> </w:t>
+      </w:r>
+      <w:r>
+        <w:rPr>
+          <w:rFonts w:ascii="Times New Roman" w:hAnsi="Times New Roman" w:cs="Times New Roman"/>
+        </w:rPr>
+        <w:t xml:space="preserve">Por fim, a análise longitudinal emparelhada no ZUMA-1 confirmou o impacto farmacodinâmico </w:t>
+      </w:r>
+      <w:proofErr w:type="spellStart"/>
+      <w:r>
+        <w:rPr>
+          <w:rFonts w:ascii="Times New Roman" w:hAnsi="Times New Roman" w:cs="Times New Roman"/>
+        </w:rPr>
+        <w:t>on</w:t>
+      </w:r>
+      <w:proofErr w:type="spellEnd"/>
+      <w:r>
+        <w:rPr>
+          <w:rFonts w:ascii="Times New Roman" w:hAnsi="Times New Roman" w:cs="Times New Roman"/>
+        </w:rPr>
+        <w:t xml:space="preserve">-target do CAR-T, mostrando uma depleção profunda e estatisticamente significativa de todos os marcadores B após a infusão (Figura 1D). Essa eliminação transcricional foi validada pela </w:t>
+      </w:r>
+      <w:proofErr w:type="spellStart"/>
+      <w:r>
+        <w:rPr>
+          <w:rFonts w:ascii="Times New Roman" w:hAnsi="Times New Roman" w:cs="Times New Roman"/>
+        </w:rPr>
+        <w:t>deconvolução</w:t>
+      </w:r>
+      <w:proofErr w:type="spellEnd"/>
+      <w:r>
+        <w:rPr>
+          <w:rFonts w:ascii="Times New Roman" w:hAnsi="Times New Roman" w:cs="Times New Roman"/>
+        </w:rPr>
+        <w:t xml:space="preserve"> celular do microambiente tumoral (Figura Suplementar S1), confirmando a depuração do clone tumoral e a aplasia B esperada. Em conjunto, esses achados mostram que a identidade de linhagem B no baseline </w:t>
+      </w:r>
+      <w:r>
+        <w:rPr>
+          <w:rFonts w:ascii="Times New Roman" w:hAnsi="Times New Roman" w:cs="Times New Roman"/>
+        </w:rPr>
+        <w:t>pode ser</w:t>
+      </w:r>
+      <w:r>
+        <w:rPr>
+          <w:rFonts w:ascii="Times New Roman" w:hAnsi="Times New Roman" w:cs="Times New Roman"/>
+        </w:rPr>
+        <w:t xml:space="preserve"> </w:t>
+      </w:r>
+      <w:r>
+        <w:rPr>
+          <w:rFonts w:ascii="Times New Roman" w:hAnsi="Times New Roman" w:cs="Times New Roman"/>
+        </w:rPr>
+        <w:t xml:space="preserve">um dos </w:t>
+      </w:r>
+      <w:r>
+        <w:rPr>
+          <w:rFonts w:ascii="Times New Roman" w:hAnsi="Times New Roman" w:cs="Times New Roman"/>
+        </w:rPr>
+        <w:t xml:space="preserve">pré-requisito para o engajamento e o sucesso terapêutico do </w:t>
+      </w:r>
+      <w:proofErr w:type="spellStart"/>
+      <w:r>
+        <w:rPr>
+          <w:rFonts w:ascii="Times New Roman" w:hAnsi="Times New Roman" w:cs="Times New Roman"/>
+        </w:rPr>
+        <w:t>Axi</w:t>
+      </w:r>
+      <w:proofErr w:type="spellEnd"/>
+      <w:r>
+        <w:rPr>
+          <w:rFonts w:ascii="Times New Roman" w:hAnsi="Times New Roman" w:cs="Times New Roman"/>
+        </w:rPr>
+        <w:t>-cel.</w:t>
+      </w:r>
+    </w:p>
+    <w:p>
+      <w:pPr>
+        <w:spacing w:after="0" w:line="480" w:lineRule="auto"/>
+        <w:jc w:val="both"/>
+        <w:rPr>
+          <w:rFonts w:ascii="Times New Roman" w:hAnsi="Times New Roman" w:cs="Times New Roman"/>
+        </w:rPr>
+      </w:pPr>
+    </w:p>
+    <w:p>
+      <w:pPr>
+        <w:spacing w:after="0" w:line="480" w:lineRule="auto"/>
+        <w:jc w:val="both"/>
+        <w:rPr>
+          <w:rFonts w:ascii="Times New Roman" w:hAnsi="Times New Roman" w:cs="Times New Roman"/>
+          <w:b/>
+          <w:bCs/>
+        </w:rPr>
+      </w:pPr>
+      <w:r>
+        <w:rPr>
+          <w:rFonts w:ascii="Times New Roman" w:hAnsi="Times New Roman" w:cs="Times New Roman"/>
+          <w:b/>
+          <w:bCs/>
+        </w:rPr>
+        <w:t xml:space="preserve">3.2 Exaustão de Células T e </w:t>
+      </w:r>
+      <w:proofErr w:type="gramStart"/>
+      <w:r>
+        <w:rPr>
+          <w:rFonts w:ascii="Times New Roman" w:hAnsi="Times New Roman" w:cs="Times New Roman"/>
+          <w:b/>
+          <w:bCs/>
+        </w:rPr>
+        <w:t>Regulação  da</w:t>
+      </w:r>
+      <w:proofErr w:type="gramEnd"/>
+      <w:r>
+        <w:rPr>
+          <w:rFonts w:ascii="Times New Roman" w:hAnsi="Times New Roman" w:cs="Times New Roman"/>
+          <w:b/>
+          <w:bCs/>
+        </w:rPr>
+        <w:t xml:space="preserve"> Maquinaria HLA Não São os Determinantes Primários da Resistência ao </w:t>
+      </w:r>
+      <w:proofErr w:type="spellStart"/>
+      <w:r>
+        <w:rPr>
+          <w:rFonts w:ascii="Times New Roman" w:hAnsi="Times New Roman" w:cs="Times New Roman"/>
+          <w:b/>
+          <w:bCs/>
+        </w:rPr>
+        <w:t>Axi</w:t>
+      </w:r>
+      <w:proofErr w:type="spellEnd"/>
+      <w:r>
+        <w:rPr>
+          <w:rFonts w:ascii="Times New Roman" w:hAnsi="Times New Roman" w:cs="Times New Roman"/>
+          <w:b/>
+          <w:bCs/>
+        </w:rPr>
+        <w:t>-cel.</w:t>
+      </w:r>
+    </w:p>
+    <w:p>
+      <w:pPr>
+        <w:spacing w:after="0" w:line="480" w:lineRule="auto"/>
+        <w:jc w:val="both"/>
+        <w:rPr>
+          <w:rFonts w:ascii="Times New Roman" w:hAnsi="Times New Roman" w:cs="Times New Roman"/>
+        </w:rPr>
+      </w:pPr>
+    </w:p>
+    <w:p>
+      <w:pPr>
+        <w:spacing w:after="0" w:line="480" w:lineRule="auto"/>
+        <w:ind w:firstLine="709"/>
+        <w:jc w:val="both"/>
+        <w:rPr>
+          <w:rFonts w:ascii="Times New Roman" w:hAnsi="Times New Roman" w:cs="Times New Roman"/>
+        </w:rPr>
+      </w:pPr>
+      <w:r>
+        <w:rPr>
+          <w:rFonts w:ascii="Times New Roman" w:hAnsi="Times New Roman" w:cs="Times New Roman"/>
+        </w:rPr>
+        <w:t xml:space="preserve">Na imunologia oncológica clássica, a evasão tumoral é frequentemente orquestrada pela indução de exaustão de células T no microambiente ou pela supressão da maquinaria de apresentação de antígenos (HLA). No entanto, o nosso mapeamento transcricional multidimensional revelou que estes eixos canónicos não ditam primariamente a falha terapêutica ao </w:t>
+      </w:r>
+      <w:proofErr w:type="spellStart"/>
+      <w:r>
+        <w:rPr>
+          <w:rFonts w:ascii="Times New Roman" w:hAnsi="Times New Roman" w:cs="Times New Roman"/>
+        </w:rPr>
+        <w:t>Axi</w:t>
+      </w:r>
+      <w:proofErr w:type="spellEnd"/>
+      <w:r>
+        <w:rPr>
+          <w:rFonts w:ascii="Times New Roman" w:hAnsi="Times New Roman" w:cs="Times New Roman"/>
+        </w:rPr>
+        <w:t>-cel.</w:t>
+      </w:r>
+      <w:r>
+        <w:rPr>
+          <w:rFonts w:ascii="Times New Roman" w:hAnsi="Times New Roman" w:cs="Times New Roman"/>
+        </w:rPr>
+        <w:t xml:space="preserve"> </w:t>
+      </w:r>
+      <w:r>
+        <w:rPr>
+          <w:rFonts w:ascii="Times New Roman" w:hAnsi="Times New Roman" w:cs="Times New Roman"/>
+        </w:rPr>
+        <w:t xml:space="preserve">A análise do perfil de expressão das assinaturas de exaustão de células T (Figura 2) não revelou a formação de agrupamentos biológicos (clusters) latentes capazes de segregar pacientes com resposta sustentada </w:t>
+      </w:r>
+      <w:r>
+        <w:rPr>
+          <w:rFonts w:ascii="Times New Roman" w:hAnsi="Times New Roman" w:cs="Times New Roman"/>
+        </w:rPr>
+        <w:lastRenderedPageBreak/>
+        <w:t xml:space="preserve">daqueles que evoluíram com falha terapêutica. Este padrão de expressão difusa e não-discriminatória foi consistente ao longo das coortes de baseline do ZUMA-7 (braços </w:t>
+      </w:r>
+      <w:proofErr w:type="spellStart"/>
+      <w:r>
+        <w:rPr>
+          <w:rFonts w:ascii="Times New Roman" w:hAnsi="Times New Roman" w:cs="Times New Roman"/>
+        </w:rPr>
+        <w:t>Axi-cel</w:t>
+      </w:r>
+      <w:proofErr w:type="spellEnd"/>
+      <w:r>
+        <w:rPr>
+          <w:rFonts w:ascii="Times New Roman" w:hAnsi="Times New Roman" w:cs="Times New Roman"/>
+        </w:rPr>
+        <w:t xml:space="preserve"> e SOC) e do ZUMA-1. Adicionalmente, a avaliação temporal destas assinaturas (pós-infusão do CAR-T) no ZUMA-1 não evidenciou flutuações longitudinais consistentes que justificassem o escape imunológic</w:t>
+      </w:r>
+      <w:r>
+        <w:rPr>
+          <w:rFonts w:ascii="Times New Roman" w:hAnsi="Times New Roman" w:cs="Times New Roman"/>
+        </w:rPr>
+        <w:t>o</w:t>
+      </w:r>
+      <w:r>
+        <w:rPr>
+          <w:rFonts w:ascii="Times New Roman" w:hAnsi="Times New Roman" w:cs="Times New Roman"/>
+        </w:rPr>
+        <w:t>.</w:t>
+      </w:r>
+    </w:p>
+    <w:p>
+      <w:pPr>
+        <w:spacing w:after="0" w:line="480" w:lineRule="auto"/>
+        <w:jc w:val="both"/>
+        <w:rPr>
+          <w:rFonts w:ascii="Times New Roman" w:hAnsi="Times New Roman" w:cs="Times New Roman"/>
+        </w:rPr>
+      </w:pPr>
+      <w:r>
+        <w:rPr>
+          <w:rFonts w:ascii="Times New Roman" w:hAnsi="Times New Roman" w:cs="Times New Roman"/>
+          <w:noProof/>
+        </w:rPr>
+        <w:drawing>
+          <wp:inline distT="0" distB="0" distL="0" distR="0" wp14:anchorId="45222A4F" wp14:editId="32DB6653">
+            <wp:extent cx="5400040" cy="6261100"/>
+            <wp:effectExtent l="0" t="0" r="0" b="6350"/>
+            <wp:docPr id="63859447" name="Imagem 4"/>
+            <wp:cNvGraphicFramePr>
+              <a:graphicFrameLocks xmlns:a="http://schemas.openxmlformats.org/drawingml/2006/main" noChangeAspect="1"/>
+            </wp:cNvGraphicFramePr>
+            <a:graphic xmlns:a="http://schemas.openxmlformats.org/drawingml/2006/main">
+              <a:graphicData uri="http://schemas.openxmlformats.org/drawingml/2006/picture">
+                <pic:pic xmlns:pic="http://schemas.openxmlformats.org/drawingml/2006/picture">
+                  <pic:nvPicPr>
+                    <pic:cNvPr id="63859447" name="Imagem 63859447"/>
+                    <pic:cNvPicPr/>
+                  </pic:nvPicPr>
+                  <pic:blipFill>
+                    <a:blip r:embed="rId7" cstate="print">
+                      <a:extLst>
+                        <a:ext uri="{28A0092B-C50C-407E-A947-70E740481C1C}">
+                          <a14:useLocalDpi xmlns:a14="http://schemas.microsoft.com/office/drawing/2010/main" val="0"/>
+                        </a:ext>
+                      </a:extLst>
+                    </a:blip>
+                    <a:stretch>
+                      <a:fillRect/>
+                    </a:stretch>
+                  </pic:blipFill>
+                  <pic:spPr>
+                    <a:xfrm>
+                      <a:off x="0" y="0"/>
+                      <a:ext cx="5400040" cy="6261100"/>
+                    </a:xfrm>
+                    <a:prstGeom prst="rect">
+                      <a:avLst/>
+                    </a:prstGeom>
+                  </pic:spPr>
+                </pic:pic>
+              </a:graphicData>
+            </a:graphic>
+          </wp:inline>
+        </w:drawing>
+      </w:r>
+    </w:p>
+    <w:p>
+      <w:pPr>
+        <w:spacing w:after="0" w:line="240" w:lineRule="auto"/>
+        <w:jc w:val="both"/>
+        <w:rPr>
+          <w:rFonts w:ascii="Times New Roman" w:hAnsi="Times New Roman" w:cs="Times New Roman"/>
+          <w:sz w:val="20"/>
+          <w:szCs w:val="20"/>
+          <w:lang w:val="en-US"/>
+        </w:rPr>
+      </w:pPr>
+      <w:r>
+        <w:rPr>
+          <w:rFonts w:ascii="Times New Roman" w:hAnsi="Times New Roman" w:cs="Times New Roman"/>
+          <w:b/>
+          <w:bCs/>
+          <w:sz w:val="20"/>
+          <w:szCs w:val="20"/>
+          <w:lang w:val="en-US"/>
+        </w:rPr>
+        <w:t>Figure 2. Transcriptional profile of immune evasion mechanisms: T-cell exhaustion in the microenvironment and regulation of the antigen presentation machinery (HLA).</w:t>
+      </w:r>
+      <w:r>
+        <w:rPr>
+          <w:rFonts w:ascii="Times New Roman" w:hAnsi="Times New Roman" w:cs="Times New Roman"/>
+          <w:sz w:val="20"/>
+          <w:szCs w:val="20"/>
+          <w:lang w:val="en-US"/>
+        </w:rPr>
+        <w:t xml:space="preserve"> Normalized gene expression profiles (Z-score) mapping the immunosuppressive architecture in the ZUMA-7 and ZUMA-1 cohorts. The first four heatmaps show the expression of T-cell exhaustion genes. The baseline profile is </w:t>
+      </w:r>
+      <w:r>
+        <w:rPr>
+          <w:rFonts w:ascii="Times New Roman" w:hAnsi="Times New Roman" w:cs="Times New Roman"/>
+          <w:sz w:val="20"/>
+          <w:szCs w:val="20"/>
+          <w:lang w:val="en-US"/>
+        </w:rPr>
+        <w:lastRenderedPageBreak/>
+        <w:t>stratified by clinical outcome (Sustained Response vs. Failure/CR vs. Non-CR) in the ZUMA-7 Axi-cel, ZUMA-7 Standard of Care (SOC), and ZUMA-1 (Baseline) cohorts, whereas the ZUMA-1 (Time point) section presents longitudinal changes in these immunosuppressive markers from the pre-infusion assessment (Baseline) to one week after CAR-T infusion (Post-CAR-T). The other four heatmaps relate to the HLA machinery: an assessment of the functional integrity of antigen presentation, biologically subdivided into four axes: classical Class I molecules, the intracellular processing complex, classical Class II molecules, and non-classical inhibitory Class I molecules. Samples (columns) are hierarchically clustered within each clinical response stratum. Top annotations provide individualized clinical context for each patient: Overall Response, detailed Clinical Classification, Molecular Subgroup/Cell of Origin, Tumor Burden (mapped on a continuous logarithmic grayscale), and occurrence of EFS (event-</w:t>
+      </w:r>
+      <w:proofErr w:type="gramStart"/>
+      <w:r>
+        <w:rPr>
+          <w:rFonts w:ascii="Times New Roman" w:hAnsi="Times New Roman" w:cs="Times New Roman"/>
+          <w:sz w:val="20"/>
+          <w:szCs w:val="20"/>
+          <w:lang w:val="en-US"/>
+        </w:rPr>
+        <w:t>free survival</w:t>
+      </w:r>
+      <w:proofErr w:type="gramEnd"/>
+      <w:r>
+        <w:rPr>
+          <w:rFonts w:ascii="Times New Roman" w:hAnsi="Times New Roman" w:cs="Times New Roman"/>
+          <w:sz w:val="20"/>
+          <w:szCs w:val="20"/>
+          <w:lang w:val="en-US"/>
+        </w:rPr>
+        <w:t xml:space="preserve">) events. Expression divergence is mapped on a Z-score scale, where intense blue represents </w:t>
+      </w:r>
+      <w:proofErr w:type="spellStart"/>
+      <w:r>
+        <w:rPr>
+          <w:rFonts w:ascii="Times New Roman" w:hAnsi="Times New Roman" w:cs="Times New Roman"/>
+          <w:sz w:val="20"/>
+          <w:szCs w:val="20"/>
+          <w:lang w:val="en-US"/>
+        </w:rPr>
+        <w:t>underexpression</w:t>
+      </w:r>
+      <w:proofErr w:type="spellEnd"/>
+      <w:r>
+        <w:rPr>
+          <w:rFonts w:ascii="Times New Roman" w:hAnsi="Times New Roman" w:cs="Times New Roman"/>
+          <w:sz w:val="20"/>
+          <w:szCs w:val="20"/>
+          <w:lang w:val="en-US"/>
+        </w:rPr>
+        <w:t xml:space="preserve"> (-2) and dark red represents overexpression (+2) relative to the cohort mean.</w:t>
+      </w:r>
+    </w:p>
+    <w:p>
+      <w:pPr>
+        <w:spacing w:after="0" w:line="480" w:lineRule="auto"/>
+        <w:jc w:val="both"/>
+        <w:rPr>
+          <w:rFonts w:ascii="Times New Roman" w:hAnsi="Times New Roman" w:cs="Times New Roman"/>
+          <w:lang w:val="en-US"/>
+        </w:rPr>
+      </w:pPr>
+    </w:p>
+    <w:p>
+      <w:pPr>
+        <w:spacing w:after="0" w:line="480" w:lineRule="auto"/>
+        <w:ind w:firstLine="709"/>
+        <w:jc w:val="both"/>
+        <w:rPr>
+          <w:rFonts w:ascii="Times New Roman" w:hAnsi="Times New Roman" w:cs="Times New Roman"/>
+        </w:rPr>
+      </w:pPr>
+      <w:r>
+        <w:rPr>
+          <w:rFonts w:ascii="Times New Roman" w:hAnsi="Times New Roman" w:cs="Times New Roman"/>
+        </w:rPr>
+        <w:t xml:space="preserve">De forma análoga, a avaliação funcional e estrutural da integridade do complexo HLA </w:t>
+      </w:r>
+      <w:r>
+        <w:rPr>
+          <w:rFonts w:ascii="Times New Roman" w:hAnsi="Times New Roman" w:cs="Times New Roman"/>
+        </w:rPr>
+        <w:t>-</w:t>
+      </w:r>
+      <w:r>
+        <w:rPr>
+          <w:rFonts w:ascii="Times New Roman" w:hAnsi="Times New Roman" w:cs="Times New Roman"/>
+        </w:rPr>
+        <w:t xml:space="preserve"> estratificada analiticamente em moléculas clássicas de Classe I, maquinaria de processamento intracelular, moléculas de Classe II e moléculas inibitórias </w:t>
+      </w:r>
+      <w:proofErr w:type="spellStart"/>
+      <w:r>
+        <w:rPr>
+          <w:rFonts w:ascii="Times New Roman" w:hAnsi="Times New Roman" w:cs="Times New Roman"/>
+        </w:rPr>
+        <w:t>não-clássicas</w:t>
+      </w:r>
+      <w:proofErr w:type="spellEnd"/>
+      <w:r>
+        <w:rPr>
+          <w:rFonts w:ascii="Times New Roman" w:hAnsi="Times New Roman" w:cs="Times New Roman"/>
+        </w:rPr>
+        <w:t xml:space="preserve"> </w:t>
+      </w:r>
+      <w:r>
+        <w:rPr>
+          <w:rFonts w:ascii="Times New Roman" w:hAnsi="Times New Roman" w:cs="Times New Roman"/>
+        </w:rPr>
+        <w:t>-</w:t>
+      </w:r>
+      <w:r>
+        <w:rPr>
+          <w:rFonts w:ascii="Times New Roman" w:hAnsi="Times New Roman" w:cs="Times New Roman"/>
+        </w:rPr>
+        <w:t xml:space="preserve"> demonstrou uma profunda heterogeneidade </w:t>
+      </w:r>
+      <w:proofErr w:type="spellStart"/>
+      <w:r>
+        <w:rPr>
+          <w:rFonts w:ascii="Times New Roman" w:hAnsi="Times New Roman" w:cs="Times New Roman"/>
+        </w:rPr>
+        <w:t>intra-coorte</w:t>
+      </w:r>
+      <w:proofErr w:type="spellEnd"/>
+      <w:r>
+        <w:rPr>
+          <w:rFonts w:ascii="Times New Roman" w:hAnsi="Times New Roman" w:cs="Times New Roman"/>
+        </w:rPr>
+        <w:t>. A clusterização hierárquica não supervisionada, mesmo quando integrada a covariáveis clínicas de forte peso, como a carga tumoral basal (SPD) e a célula de origem (COO), confirmou a ausência de um perfil de supressão do HLA unívoca ou majoritariamente associado à resistência ao CAR-T.</w:t>
+      </w:r>
+    </w:p>
+    <w:p>
+      <w:pPr>
+        <w:spacing w:after="0" w:line="480" w:lineRule="auto"/>
+        <w:ind w:firstLine="709"/>
+        <w:jc w:val="both"/>
+        <w:rPr>
+          <w:rFonts w:ascii="Times New Roman" w:hAnsi="Times New Roman" w:cs="Times New Roman"/>
+        </w:rPr>
+      </w:pPr>
+      <w:r>
+        <w:rPr>
+          <w:rFonts w:ascii="Times New Roman" w:hAnsi="Times New Roman" w:cs="Times New Roman"/>
+        </w:rPr>
+        <w:t>Em conjunto, estes dados contrariam os dogmas de evasão amplamente descritos para inibidores de checkpoint imunológico. Os nossos achados sugerem que, devido à natureza sintética do seu reconhecimento antigénico, a eficácia do CAR-T anti-CD19 opera com notável independência das vias tradicionais de restrição pelo HLA e do grau de exaustão imunológica pré-existente, apontando a necessidade de investigar mecanismos alternativos de resistência intrínseca tumoral.</w:t>
+      </w:r>
+    </w:p>
+    <w:p>
+      <w:pPr>
+        <w:spacing w:after="0" w:line="480" w:lineRule="auto"/>
+        <w:jc w:val="both"/>
+        <w:rPr>
+          <w:rFonts w:ascii="Times New Roman" w:hAnsi="Times New Roman" w:cs="Times New Roman"/>
+        </w:rPr>
+      </w:pPr>
+    </w:p>
+    <w:p>
+      <w:pPr>
+        <w:spacing w:after="0" w:line="480" w:lineRule="auto"/>
+        <w:jc w:val="both"/>
+        <w:rPr>
+          <w:rFonts w:ascii="Times New Roman" w:hAnsi="Times New Roman" w:cs="Times New Roman"/>
+        </w:rPr>
+      </w:pPr>
+    </w:p>
+    <w:p>
+      <w:pPr>
+        <w:spacing w:after="0" w:line="480" w:lineRule="auto"/>
+        <w:jc w:val="both"/>
+        <w:rPr>
+          <w:rFonts w:ascii="Times New Roman" w:hAnsi="Times New Roman" w:cs="Times New Roman"/>
+        </w:rPr>
+      </w:pPr>
+    </w:p>
+    <w:p>
+      <w:pPr>
+        <w:spacing w:after="0" w:line="480" w:lineRule="auto"/>
+        <w:jc w:val="both"/>
+        <w:rPr>
+          <w:rFonts w:ascii="Times New Roman" w:hAnsi="Times New Roman" w:cs="Times New Roman"/>
+        </w:rPr>
+      </w:pPr>
+    </w:p>
+    <w:p>
+      <w:pPr>
+        <w:spacing w:after="0" w:line="480" w:lineRule="auto"/>
+        <w:jc w:val="both"/>
+        <w:rPr>
+          <w:rFonts w:ascii="Times New Roman" w:hAnsi="Times New Roman" w:cs="Times New Roman"/>
+        </w:rPr>
+      </w:pPr>
+      <w:r>
+        <w:rPr>
+          <w:rFonts w:ascii="Times New Roman" w:hAnsi="Times New Roman" w:cs="Times New Roman"/>
+        </w:rPr>
         <w:t>Referências</w:t>
       </w:r>
     </w:p>
     <w:p>
       <w:pPr>
+        <w:spacing w:after="0" w:line="480" w:lineRule="auto"/>
+        <w:jc w:val="both"/>
         <w:rPr>
           <w:rFonts w:ascii="Times New Roman" w:hAnsi="Times New Roman" w:cs="Times New Roman"/>
         </w:rPr>
@@ -1943,6 +2898,7 @@
   <w:style w:type="character" w:default="1" w:styleId="Fontepargpadro">
     <w:name w:val="Default Paragraph Font"/>
     <w:uiPriority w:val="1"/>
+    <w:semiHidden/>
     <w:unhideWhenUsed/>
   </w:style>
   <w:style w:type="table" w:default="1" w:styleId="Tabelanormal">

</xml_diff>